<commit_message>
docs: regenerate feature list with tasks #56-#75 additions
Updated sections:
- Authentication: multi-select situations, pre-fill banner, persona accounts detail
- Impact Wizard: career break parsing, view full report from history
- Activity Suggestions: new section for interest-based and related-pairs logic
- Milestones: new section (renamed from Badges) with share card detail
- AI Sidekick: push layout, all new persona depths, org manager context
- Sharing & Export: milestone share cards
- Contact & Feedback: new section covering contact form + feedback mode
- Public Pages: new section covering What's New, Privacy, About
- Admin & Analytics: admin nav link, page view tracking detail
- Personas: added informal carer, charity manager, trustee scepticism
</commit_message>
<xml_diff>
--- a/My Impact - Full Feature List.docx
+++ b/My Impact - Full Feature List.docx
@@ -30,7 +30,7 @@
           <w:sz w:val="22"/>
           <w:szCs w:val="22"/>
         </w:rPr>
-        <w:t xml:space="preserve">March 2026</w:t>
+        <w:t xml:space="preserve">March 2026 (updated)</w:t>
       </w:r>
     </w:p>
     <w:p>
@@ -102,7 +102,7 @@
           <w:sz w:val="22"/>
           <w:szCs w:val="22"/>
         </w:rPr>
-        <w:t xml:space="preserve">Instant demo login for persona accounts, bypassing the email step</w:t>
+        <w:t xml:space="preserve">Instant demo login for six pre-defined persona accounts (volunteer, student, carer, veteran, apprentice, job seeker), bypassing the email step entirely</w:t>
       </w:r>
     </w:p>
     <w:p>
@@ -138,25 +138,43 @@
           <w:sz w:val="22"/>
           <w:szCs w:val="22"/>
         </w:rPr>
-        <w:t xml:space="preserve">User profile setup capturing name and situational context (e.g. student, volunteer, carer, armed forces, apprentice, job seeker, career break)</w:t>
-      </w:r>
-    </w:p>
-    <w:p>
-      <w:pPr>
-        <w:pStyle w:val="ListParagraph"/>
-        <w:numPr>
-          <w:ilvl w:val="0"/>
-          <w:numId w:val="1"/>
-        </w:numPr>
-        <w:spacing w:after="60" w:before="60"/>
-      </w:pPr>
-      <w:r>
-        <w:rPr>
-          <w:color w:val="213547"/>
-          <w:sz w:val="22"/>
-          <w:szCs w:val="22"/>
-        </w:rPr>
-        <w:t xml:space="preserve">Multi-select situation tags so users can identify with more than one context</w:t>
+        <w:t xml:space="preserve">User profile setup flow capturing display name and situational context</w:t>
+      </w:r>
+    </w:p>
+    <w:p>
+      <w:pPr>
+        <w:pStyle w:val="ListParagraph"/>
+        <w:numPr>
+          <w:ilvl w:val="0"/>
+          <w:numId w:val="1"/>
+        </w:numPr>
+        <w:spacing w:after="60" w:before="60"/>
+      </w:pPr>
+      <w:r>
+        <w:rPr>
+          <w:color w:val="213547"/>
+          <w:sz w:val="22"/>
+          <w:szCs w:val="22"/>
+        </w:rPr>
+        <w:t xml:space="preserve">Multi-select situation tags: users can identify with more than one context simultaneously (e.g. student and volunteer)</w:t>
+      </w:r>
+    </w:p>
+    <w:p>
+      <w:pPr>
+        <w:pStyle w:val="ListParagraph"/>
+        <w:numPr>
+          <w:ilvl w:val="0"/>
+          <w:numId w:val="1"/>
+        </w:numPr>
+        <w:spacing w:after="60" w:before="60"/>
+      </w:pPr>
+      <w:r>
+        <w:rPr>
+          <w:color w:val="213547"/>
+          <w:sz w:val="22"/>
+          <w:szCs w:val="22"/>
+        </w:rPr>
+        <w:t xml:space="preserve">Profile data pre-filled into the wizard on return visits with a visible confirmation banner</w:t>
       </w:r>
     </w:p>
     <w:p>
@@ -192,7 +210,7 @@
           <w:sz w:val="22"/>
           <w:szCs w:val="22"/>
         </w:rPr>
-        <w:t xml:space="preserve">Settings page for managing account details</w:t>
+        <w:t xml:space="preserve">Account settings page for managing display name, email, high contrast preference, and sign-out</w:t>
       </w:r>
     </w:p>
     <w:p>
@@ -228,7 +246,7 @@
           <w:sz w:val="22"/>
           <w:szCs w:val="22"/>
         </w:rPr>
-        <w:t xml:space="preserve">Multi-step guided wizard covering location, interests, activities, and contributions</w:t>
+        <w:t xml:space="preserve">Multi-step guided wizard covering location, interests, situations, activities, and contributions</w:t>
       </w:r>
     </w:p>
     <w:p>
@@ -282,79 +300,97 @@
           <w:sz w:val="22"/>
           <w:szCs w:val="22"/>
         </w:rPr>
-        <w:t xml:space="preserve">Free-text activity mode: users describe their activity in plain language and AI matches it to the correct SVE proxy (toggled via a switch above the form)</w:t>
-      </w:r>
-    </w:p>
-    <w:p>
-      <w:pPr>
-        <w:pStyle w:val="ListParagraph"/>
-        <w:numPr>
-          <w:ilvl w:val="0"/>
-          <w:numId w:val="1"/>
-        </w:numPr>
-        <w:spacing w:after="60" w:before="60"/>
-      </w:pPr>
-      <w:r>
-        <w:rPr>
-          <w:color w:val="213547"/>
-          <w:sz w:val="22"/>
-          <w:szCs w:val="22"/>
-        </w:rPr>
-        <w:t xml:space="preserve">Wizard questions and framing adapt based on the user's profile and situational context</w:t>
-      </w:r>
-    </w:p>
-    <w:p>
-      <w:pPr>
-        <w:pStyle w:val="ListParagraph"/>
-        <w:numPr>
-          <w:ilvl w:val="0"/>
-          <w:numId w:val="1"/>
-        </w:numPr>
-        <w:spacing w:after="60" w:before="60"/>
-      </w:pPr>
-      <w:r>
-        <w:rPr>
-          <w:color w:val="213547"/>
-          <w:sz w:val="22"/>
-          <w:szCs w:val="22"/>
-        </w:rPr>
-        <w:t xml:space="preserve">Progress is saved mid-wizard so users can return and continue</w:t>
-      </w:r>
-    </w:p>
-    <w:p>
-      <w:pPr>
-        <w:pStyle w:val="ListParagraph"/>
-        <w:numPr>
-          <w:ilvl w:val="0"/>
-          <w:numId w:val="1"/>
-        </w:numPr>
-        <w:spacing w:after="60" w:before="60"/>
-      </w:pPr>
-      <w:r>
-        <w:rPr>
-          <w:color w:val="213547"/>
-          <w:sz w:val="22"/>
-          <w:szCs w:val="22"/>
-        </w:rPr>
-        <w:t xml:space="preserve">Support for logging recurring activities</w:t>
-      </w:r>
-    </w:p>
-    <w:p>
-      <w:pPr>
-        <w:pStyle w:val="ListParagraph"/>
-        <w:numPr>
-          <w:ilvl w:val="0"/>
-          <w:numId w:val="1"/>
-        </w:numPr>
-        <w:spacing w:after="60" w:before="60"/>
-      </w:pPr>
-      <w:r>
-        <w:rPr>
-          <w:color w:val="213547"/>
-          <w:sz w:val="22"/>
-          <w:szCs w:val="22"/>
-        </w:rPr>
-        <w:t xml:space="preserve">Career break included as a supported situational context throughout the wizard</w:t>
+        <w:t xml:space="preserve">Free-text activity mode: users describe their activity in plain language and AI matches it to the correct SVE proxy</w:t>
+      </w:r>
+    </w:p>
+    <w:p>
+      <w:pPr>
+        <w:pStyle w:val="ListParagraph"/>
+        <w:numPr>
+          <w:ilvl w:val="0"/>
+          <w:numId w:val="1"/>
+        </w:numPr>
+        <w:spacing w:after="60" w:before="60"/>
+      </w:pPr>
+      <w:r>
+        <w:rPr>
+          <w:color w:val="213547"/>
+          <w:sz w:val="22"/>
+          <w:szCs w:val="22"/>
+        </w:rPr>
+        <w:t xml:space="preserve">Wizard personalises its framing based on the user's profile and situational context (student, carer, veteran, apprentice, job seeker, career break, volunteer)</w:t>
+      </w:r>
+    </w:p>
+    <w:p>
+      <w:pPr>
+        <w:pStyle w:val="ListParagraph"/>
+        <w:numPr>
+          <w:ilvl w:val="0"/>
+          <w:numId w:val="1"/>
+        </w:numPr>
+        <w:spacing w:after="60" w:before="60"/>
+      </w:pPr>
+      <w:r>
+        <w:rPr>
+          <w:color w:val="213547"/>
+          <w:sz w:val="22"/>
+          <w:szCs w:val="22"/>
+        </w:rPr>
+        <w:t xml:space="preserve">Career break parsing recognises informal care language ('stay at home parent', 'raising children', 'looking after grandchildren') and maps correctly to SVE proxies</w:t>
+      </w:r>
+    </w:p>
+    <w:p>
+      <w:pPr>
+        <w:pStyle w:val="ListParagraph"/>
+        <w:numPr>
+          <w:ilvl w:val="0"/>
+          <w:numId w:val="1"/>
+        </w:numPr>
+        <w:spacing w:after="60" w:before="60"/>
+      </w:pPr>
+      <w:r>
+        <w:rPr>
+          <w:color w:val="213547"/>
+          <w:sz w:val="22"/>
+          <w:szCs w:val="22"/>
+        </w:rPr>
+        <w:t xml:space="preserve">Draft auto-save: progress is persisted mid-wizard so users can return and continue</w:t>
+      </w:r>
+    </w:p>
+    <w:p>
+      <w:pPr>
+        <w:pStyle w:val="ListParagraph"/>
+        <w:numPr>
+          <w:ilvl w:val="0"/>
+          <w:numId w:val="1"/>
+        </w:numPr>
+        <w:spacing w:after="60" w:before="60"/>
+      </w:pPr>
+      <w:r>
+        <w:rPr>
+          <w:color w:val="213547"/>
+          <w:sz w:val="22"/>
+          <w:szCs w:val="22"/>
+        </w:rPr>
+        <w:t xml:space="preserve">'Resuming your last session' banner shown when a draft is detected</w:t>
+      </w:r>
+    </w:p>
+    <w:p>
+      <w:pPr>
+        <w:pStyle w:val="ListParagraph"/>
+        <w:numPr>
+          <w:ilvl w:val="0"/>
+          <w:numId w:val="1"/>
+        </w:numPr>
+        <w:spacing w:after="60" w:before="60"/>
+      </w:pPr>
+      <w:r>
+        <w:rPr>
+          <w:color w:val="213547"/>
+          <w:sz w:val="22"/>
+          <w:szCs w:val="22"/>
+        </w:rPr>
+        <w:t xml:space="preserve">'View full report' button on the History page reopens the full interactive Results page for any saved record without re-running the calculation</w:t>
       </w:r>
     </w:p>
     <w:p>
@@ -390,7 +426,7 @@
           <w:sz w:val="22"/>
           <w:szCs w:val="22"/>
         </w:rPr>
-        <w:t xml:space="preserve">Social Return on Investment (SROI) calculated using real, verified SVE proxy data (not sample or placeholder figures)</w:t>
+        <w:t xml:space="preserve">Social Return on Investment (SROI) calculated using real, verified SVE proxy data</w:t>
       </w:r>
     </w:p>
     <w:p>
@@ -588,6 +624,24 @@
           <w:sz w:val="22"/>
           <w:szCs w:val="22"/>
         </w:rPr>
+        <w:t xml:space="preserve">Milestones earned displayed on the results page with a link to the full Milestones view</w:t>
+      </w:r>
+    </w:p>
+    <w:p>
+      <w:pPr>
+        <w:pStyle w:val="ListParagraph"/>
+        <w:numPr>
+          <w:ilvl w:val="0"/>
+          <w:numId w:val="1"/>
+        </w:numPr>
+        <w:spacing w:after="60" w:before="60"/>
+      </w:pPr>
+      <w:r>
+        <w:rPr>
+          <w:color w:val="213547"/>
+          <w:sz w:val="22"/>
+          <w:szCs w:val="22"/>
+        </w:rPr>
         <w:t xml:space="preserve">"Inspire me" feature on the home page to prompt new activity ideas</w:t>
       </w:r>
     </w:p>
@@ -642,6 +696,24 @@
           <w:sz w:val="22"/>
           <w:szCs w:val="22"/>
         </w:rPr>
+        <w:t xml:space="preserve">'View full report' button reopens any saved record as a fully interactive Results page</w:t>
+      </w:r>
+    </w:p>
+    <w:p>
+      <w:pPr>
+        <w:pStyle w:val="ListParagraph"/>
+        <w:numPr>
+          <w:ilvl w:val="0"/>
+          <w:numId w:val="1"/>
+        </w:numPr>
+        <w:spacing w:after="60" w:before="60"/>
+      </w:pPr>
+      <w:r>
+        <w:rPr>
+          <w:color w:val="213547"/>
+          <w:sz w:val="22"/>
+          <w:szCs w:val="22"/>
+        </w:rPr>
         <w:t xml:space="preserve">Edit individual records after submission</w:t>
       </w:r>
     </w:p>
@@ -679,42 +751,6 @@
           <w:szCs w:val="22"/>
         </w:rPr>
         <w:t xml:space="preserve">Full reset option to clear all history</w:t>
-      </w:r>
-    </w:p>
-    <w:p>
-      <w:pPr>
-        <w:pStyle w:val="ListParagraph"/>
-        <w:numPr>
-          <w:ilvl w:val="0"/>
-          <w:numId w:val="1"/>
-        </w:numPr>
-        <w:spacing w:after="60" w:before="60"/>
-      </w:pPr>
-      <w:r>
-        <w:rPr>
-          <w:color w:val="213547"/>
-          <w:sz w:val="22"/>
-          <w:szCs w:val="22"/>
-        </w:rPr>
-        <w:t xml:space="preserve">Duplicate record prevention</w:t>
-      </w:r>
-    </w:p>
-    <w:p>
-      <w:pPr>
-        <w:pStyle w:val="ListParagraph"/>
-        <w:numPr>
-          <w:ilvl w:val="0"/>
-          <w:numId w:val="1"/>
-        </w:numPr>
-        <w:spacing w:after="60" w:before="60"/>
-      </w:pPr>
-      <w:r>
-        <w:rPr>
-          <w:color w:val="213547"/>
-          <w:sz w:val="22"/>
-          <w:szCs w:val="22"/>
-        </w:rPr>
-        <w:t xml:space="preserve">Chart and data accuracy fixes applied</w:t>
       </w:r>
     </w:p>
     <w:p>
@@ -822,133 +858,79 @@
           <w:sz w:val="28"/>
           <w:szCs w:val="28"/>
         </w:rPr>
-        <w:t xml:space="preserve">AI Sidekick</w:t>
-      </w:r>
-    </w:p>
-    <w:p>
-      <w:pPr>
-        <w:pStyle w:val="ListParagraph"/>
-        <w:numPr>
-          <w:ilvl w:val="0"/>
-          <w:numId w:val="1"/>
-        </w:numPr>
-        <w:spacing w:after="60" w:before="60"/>
-      </w:pPr>
-      <w:r>
-        <w:rPr>
-          <w:color w:val="213547"/>
-          <w:sz w:val="22"/>
-          <w:szCs w:val="22"/>
-        </w:rPr>
-        <w:t xml:space="preserve">Embedded AI chat assistant powered by OpenAI</w:t>
-      </w:r>
-    </w:p>
-    <w:p>
-      <w:pPr>
-        <w:pStyle w:val="ListParagraph"/>
-        <w:numPr>
-          <w:ilvl w:val="0"/>
-          <w:numId w:val="1"/>
-        </w:numPr>
-        <w:spacing w:after="60" w:before="60"/>
-      </w:pPr>
-      <w:r>
-        <w:rPr>
-          <w:color w:val="213547"/>
-          <w:sz w:val="22"/>
-          <w:szCs w:val="22"/>
-        </w:rPr>
-        <w:t xml:space="preserve">Capable of answering social value questions, helping draft CV bullet points, and supporting UCAS personal statement writing</w:t>
-      </w:r>
-    </w:p>
-    <w:p>
-      <w:pPr>
-        <w:pStyle w:val="ListParagraph"/>
-        <w:numPr>
-          <w:ilvl w:val="0"/>
-          <w:numId w:val="1"/>
-        </w:numPr>
-        <w:spacing w:after="60" w:before="60"/>
-      </w:pPr>
-      <w:r>
-        <w:rPr>
-          <w:color w:val="213547"/>
-          <w:sz w:val="22"/>
-          <w:szCs w:val="22"/>
-        </w:rPr>
-        <w:t xml:space="preserve">Responses use plain, accessible language rather than technical terminology</w:t>
-      </w:r>
-    </w:p>
-    <w:p>
-      <w:pPr>
-        <w:pStyle w:val="ListParagraph"/>
-        <w:numPr>
-          <w:ilvl w:val="0"/>
-          <w:numId w:val="1"/>
-        </w:numPr>
-        <w:spacing w:after="60" w:before="60"/>
-      </w:pPr>
-      <w:r>
-        <w:rPr>
-          <w:color w:val="213547"/>
-          <w:sz w:val="22"/>
-          <w:szCs w:val="22"/>
-        </w:rPr>
-        <w:t xml:space="preserve">Expanded knowledge base covering SVE methodology, local volunteering, and application writing</w:t>
-      </w:r>
-    </w:p>
-    <w:p>
-      <w:pPr>
-        <w:pStyle w:val="ListParagraph"/>
-        <w:numPr>
-          <w:ilvl w:val="0"/>
-          <w:numId w:val="1"/>
-        </w:numPr>
-        <w:spacing w:after="60" w:before="60"/>
-      </w:pPr>
-      <w:r>
-        <w:rPr>
-          <w:color w:val="213547"/>
-          <w:sz w:val="22"/>
-          <w:szCs w:val="22"/>
-        </w:rPr>
-        <w:t xml:space="preserve">Persona-specific depth: tailored responses for users returning to work, with caring responsibilities, or from an armed forces background</w:t>
-      </w:r>
-    </w:p>
-    <w:p>
-      <w:pPr>
-        <w:pStyle w:val="ListParagraph"/>
-        <w:numPr>
-          <w:ilvl w:val="0"/>
-          <w:numId w:val="1"/>
-        </w:numPr>
-        <w:spacing w:after="60" w:before="60"/>
-      </w:pPr>
-      <w:r>
-        <w:rPr>
-          <w:color w:val="213547"/>
-          <w:sz w:val="22"/>
-          <w:szCs w:val="22"/>
-        </w:rPr>
-        <w:t xml:space="preserve">Animated thinking indicator shown while a response is being generated</w:t>
-      </w:r>
-    </w:p>
-    <w:p>
-      <w:pPr>
-        <w:pStyle w:val="ListParagraph"/>
-        <w:numPr>
-          <w:ilvl w:val="0"/>
-          <w:numId w:val="1"/>
-        </w:numPr>
-        <w:spacing w:after="60" w:before="60"/>
-      </w:pPr>
-      <w:r>
-        <w:rPr>
-          <w:color w:val="213547"/>
-          <w:sz w:val="22"/>
-          <w:szCs w:val="22"/>
-        </w:rPr>
-        <w:t xml:space="preserve">Guidance accuracy improved for activity logging prompts</w:t>
+        <w:t xml:space="preserve">Activity Suggestions</w:t>
+      </w:r>
+    </w:p>
+    <w:p>
+      <w:pPr>
+        <w:pStyle w:val="ListParagraph"/>
+        <w:numPr>
+          <w:ilvl w:val="0"/>
+          <w:numId w:val="1"/>
+        </w:numPr>
+        <w:spacing w:after="60" w:before="60"/>
+      </w:pPr>
+      <w:r>
+        <w:rPr>
+          <w:color w:val="213547"/>
+          <w:sz w:val="22"/>
+          <w:szCs w:val="22"/>
+        </w:rPr>
+        <w:t xml:space="preserve">Personalised activity suggestions based on the user's stated interests (e.g. environment, mental health, community)</w:t>
+      </w:r>
+    </w:p>
+    <w:p>
+      <w:pPr>
+        <w:pStyle w:val="ListParagraph"/>
+        <w:numPr>
+          <w:ilvl w:val="0"/>
+          <w:numId w:val="1"/>
+        </w:numPr>
+        <w:spacing w:after="60" w:before="60"/>
+      </w:pPr>
+      <w:r>
+        <w:rPr>
+          <w:color w:val="213547"/>
+          <w:sz w:val="22"/>
+          <w:szCs w:val="22"/>
+        </w:rPr>
+        <w:t xml:space="preserve">Contextual 'since you already do X, consider Y' suggestions surface even when no interests are stated, using related-activity pairs</w:t>
+      </w:r>
+    </w:p>
+    <w:p>
+      <w:pPr>
+        <w:pStyle w:val="ListParagraph"/>
+        <w:numPr>
+          <w:ilvl w:val="0"/>
+          <w:numId w:val="1"/>
+        </w:numPr>
+        <w:spacing w:after="60" w:before="60"/>
+      </w:pPr>
+      <w:r>
+        <w:rPr>
+          <w:color w:val="213547"/>
+          <w:sz w:val="22"/>
+          <w:szCs w:val="22"/>
+        </w:rPr>
+        <w:t xml:space="preserve">Suggestions ranked by estimated social value impact</w:t>
+      </w:r>
+    </w:p>
+    <w:p>
+      <w:pPr>
+        <w:pStyle w:val="ListParagraph"/>
+        <w:numPr>
+          <w:ilvl w:val="0"/>
+          <w:numId w:val="1"/>
+        </w:numPr>
+        <w:spacing w:after="60" w:before="60"/>
+      </w:pPr>
+      <w:r>
+        <w:rPr>
+          <w:color w:val="213547"/>
+          <w:sz w:val="22"/>
+          <w:szCs w:val="22"/>
+        </w:rPr>
+        <w:t xml:space="preserve">Suggestion reasons tailored to the user's interest categories</w:t>
       </w:r>
     </w:p>
     <w:p>
@@ -966,79 +948,133 @@
           <w:sz w:val="28"/>
           <w:szCs w:val="28"/>
         </w:rPr>
-        <w:t xml:space="preserve">Sharing and Export</w:t>
-      </w:r>
-    </w:p>
-    <w:p>
-      <w:pPr>
-        <w:pStyle w:val="ListParagraph"/>
-        <w:numPr>
-          <w:ilvl w:val="0"/>
-          <w:numId w:val="1"/>
-        </w:numPr>
-        <w:spacing w:after="60" w:before="60"/>
-      </w:pPr>
-      <w:r>
-        <w:rPr>
-          <w:color w:val="213547"/>
-          <w:sz w:val="22"/>
-          <w:szCs w:val="22"/>
-        </w:rPr>
-        <w:t xml:space="preserve">Impact report exported as a PDF formatted for LinkedIn</w:t>
-      </w:r>
-    </w:p>
-    <w:p>
-      <w:pPr>
-        <w:pStyle w:val="ListParagraph"/>
-        <w:numPr>
-          <w:ilvl w:val="0"/>
-          <w:numId w:val="1"/>
-        </w:numPr>
-        <w:spacing w:after="60" w:before="60"/>
-      </w:pPr>
-      <w:r>
-        <w:rPr>
-          <w:color w:val="213547"/>
-          <w:sz w:val="22"/>
-          <w:szCs w:val="22"/>
-        </w:rPr>
-        <w:t xml:space="preserve">Shareable image (PNG) of impact statistics generated for social media</w:t>
-      </w:r>
-    </w:p>
-    <w:p>
-      <w:pPr>
-        <w:pStyle w:val="ListParagraph"/>
-        <w:numPr>
-          <w:ilvl w:val="0"/>
-          <w:numId w:val="1"/>
-        </w:numPr>
-        <w:spacing w:after="60" w:before="60"/>
-      </w:pPr>
-      <w:r>
-        <w:rPr>
-          <w:color w:val="213547"/>
-          <w:sz w:val="22"/>
-          <w:szCs w:val="22"/>
-        </w:rPr>
-        <w:t xml:space="preserve">Digital milestone badges awarded for reaching activity and impact thresholds</w:t>
-      </w:r>
-    </w:p>
-    <w:p>
-      <w:pPr>
-        <w:pStyle w:val="ListParagraph"/>
-        <w:numPr>
-          <w:ilvl w:val="0"/>
-          <w:numId w:val="1"/>
-        </w:numPr>
-        <w:spacing w:after="60" w:before="60"/>
-      </w:pPr>
-      <w:r>
-        <w:rPr>
-          <w:color w:val="213547"/>
-          <w:sz w:val="22"/>
-          <w:szCs w:val="22"/>
-        </w:rPr>
-        <w:t xml:space="preserve">Visual fixes applied to both PDF and PNG export outputs</w:t>
+        <w:t xml:space="preserve">Milestones</w:t>
+      </w:r>
+    </w:p>
+    <w:p>
+      <w:pPr>
+        <w:pStyle w:val="ListParagraph"/>
+        <w:numPr>
+          <w:ilvl w:val="0"/>
+          <w:numId w:val="1"/>
+        </w:numPr>
+        <w:spacing w:after="60" w:before="60"/>
+      </w:pPr>
+      <w:r>
+        <w:rPr>
+          <w:color w:val="213547"/>
+          <w:sz w:val="22"/>
+          <w:szCs w:val="22"/>
+        </w:rPr>
+        <w:t xml:space="preserve">Digital milestone badges awarded when users reach activity and impact thresholds</w:t>
+      </w:r>
+    </w:p>
+    <w:p>
+      <w:pPr>
+        <w:pStyle w:val="ListParagraph"/>
+        <w:numPr>
+          <w:ilvl w:val="0"/>
+          <w:numId w:val="1"/>
+        </w:numPr>
+        <w:spacing w:after="60" w:before="60"/>
+      </w:pPr>
+      <w:r>
+        <w:rPr>
+          <w:color w:val="213547"/>
+          <w:sz w:val="22"/>
+          <w:szCs w:val="22"/>
+        </w:rPr>
+        <w:t xml:space="preserve">Locked milestones shown as encouragement alongside earned ones</w:t>
+      </w:r>
+    </w:p>
+    <w:p>
+      <w:pPr>
+        <w:pStyle w:val="ListParagraph"/>
+        <w:numPr>
+          <w:ilvl w:val="0"/>
+          <w:numId w:val="1"/>
+        </w:numPr>
+        <w:spacing w:after="60" w:before="60"/>
+      </w:pPr>
+      <w:r>
+        <w:rPr>
+          <w:color w:val="213547"/>
+          <w:sz w:val="22"/>
+          <w:szCs w:val="22"/>
+        </w:rPr>
+        <w:t xml:space="preserve">Share button on each earned milestone opens a share modal</w:t>
+      </w:r>
+    </w:p>
+    <w:p>
+      <w:pPr>
+        <w:pStyle w:val="ListParagraph"/>
+        <w:numPr>
+          <w:ilvl w:val="0"/>
+          <w:numId w:val="1"/>
+        </w:numPr>
+        <w:spacing w:after="60" w:before="60"/>
+      </w:pPr>
+      <w:r>
+        <w:rPr>
+          <w:color w:val="213547"/>
+          <w:sz w:val="22"/>
+          <w:szCs w:val="22"/>
+        </w:rPr>
+        <w:t xml:space="preserve">Share modal supports landscape (1200×630 px, ideal for LinkedIn and Twitter) and portrait (1080×1080 px, ideal for Instagram) formats</w:t>
+      </w:r>
+    </w:p>
+    <w:p>
+      <w:pPr>
+        <w:pStyle w:val="ListParagraph"/>
+        <w:numPr>
+          <w:ilvl w:val="0"/>
+          <w:numId w:val="1"/>
+        </w:numPr>
+        <w:spacing w:after="60" w:before="60"/>
+      </w:pPr>
+      <w:r>
+        <w:rPr>
+          <w:color w:val="213547"/>
+          <w:sz w:val="22"/>
+          <w:szCs w:val="22"/>
+        </w:rPr>
+        <w:t xml:space="preserve">Social share buttons for LinkedIn, Twitter/X, and Facebook with pre-populated post text</w:t>
+      </w:r>
+    </w:p>
+    <w:p>
+      <w:pPr>
+        <w:pStyle w:val="ListParagraph"/>
+        <w:numPr>
+          <w:ilvl w:val="0"/>
+          <w:numId w:val="1"/>
+        </w:numPr>
+        <w:spacing w:after="60" w:before="60"/>
+      </w:pPr>
+      <w:r>
+        <w:rPr>
+          <w:color w:val="213547"/>
+          <w:sz w:val="22"/>
+          <w:szCs w:val="22"/>
+        </w:rPr>
+        <w:t xml:space="preserve">High-resolution PNG download of the share card at 2× scale</w:t>
+      </w:r>
+    </w:p>
+    <w:p>
+      <w:pPr>
+        <w:pStyle w:val="ListParagraph"/>
+        <w:numPr>
+          <w:ilvl w:val="0"/>
+          <w:numId w:val="1"/>
+        </w:numPr>
+        <w:spacing w:after="60" w:before="60"/>
+      </w:pPr>
+      <w:r>
+        <w:rPr>
+          <w:color w:val="213547"/>
+          <w:sz w:val="22"/>
+          <w:szCs w:val="22"/>
+        </w:rPr>
+        <w:t xml:space="preserve">Share card displays the user's milestone name, description, total social value score, and the My Impact URL</w:t>
       </w:r>
     </w:p>
     <w:p>
@@ -1056,223 +1092,277 @@
           <w:sz w:val="28"/>
           <w:szCs w:val="28"/>
         </w:rPr>
-        <w:t xml:space="preserve">Organisation Portal</w:t>
-      </w:r>
-    </w:p>
-    <w:p>
-      <w:pPr>
-        <w:pStyle w:val="ListParagraph"/>
-        <w:numPr>
-          <w:ilvl w:val="0"/>
-          <w:numId w:val="1"/>
-        </w:numPr>
-        <w:spacing w:after="60" w:before="60"/>
-      </w:pPr>
-      <w:r>
-        <w:rPr>
-          <w:color w:val="213547"/>
-          <w:sz w:val="22"/>
-          <w:szCs w:val="22"/>
-        </w:rPr>
-        <w:t xml:space="preserve">Organisation registration flow for schools, charities, universities, and local authorities</w:t>
-      </w:r>
-    </w:p>
-    <w:p>
-      <w:pPr>
-        <w:pStyle w:val="ListParagraph"/>
-        <w:numPr>
-          <w:ilvl w:val="0"/>
-          <w:numId w:val="1"/>
-        </w:numPr>
-        <w:spacing w:after="60" w:before="60"/>
-      </w:pPr>
-      <w:r>
-        <w:rPr>
-          <w:color w:val="213547"/>
-          <w:sz w:val="22"/>
-          <w:szCs w:val="22"/>
-        </w:rPr>
-        <w:t xml:space="preserve">Confirmation email sent to the registering admin via Resend</w:t>
-      </w:r>
-    </w:p>
-    <w:p>
-      <w:pPr>
-        <w:pStyle w:val="ListParagraph"/>
-        <w:numPr>
-          <w:ilvl w:val="0"/>
-          <w:numId w:val="1"/>
-        </w:numPr>
-        <w:spacing w:after="60" w:before="60"/>
-      </w:pPr>
-      <w:r>
-        <w:rPr>
-          <w:color w:val="213547"/>
-          <w:sz w:val="22"/>
-          <w:szCs w:val="22"/>
-        </w:rPr>
-        <w:t xml:space="preserve">Unique invite code and shareable invite link generated per organisation</w:t>
-      </w:r>
-    </w:p>
-    <w:p>
-      <w:pPr>
-        <w:pStyle w:val="ListParagraph"/>
-        <w:numPr>
-          <w:ilvl w:val="0"/>
-          <w:numId w:val="1"/>
-        </w:numPr>
-        <w:spacing w:after="60" w:before="60"/>
-      </w:pPr>
-      <w:r>
-        <w:rPr>
-          <w:color w:val="213547"/>
-          <w:sz w:val="22"/>
-          <w:szCs w:val="22"/>
-        </w:rPr>
-        <w:t xml:space="preserve">Organisation-contextual login screen shown when users arrive via an invite link</w:t>
-      </w:r>
-    </w:p>
-    <w:p>
-      <w:pPr>
-        <w:pStyle w:val="ListParagraph"/>
-        <w:numPr>
-          <w:ilvl w:val="0"/>
-          <w:numId w:val="1"/>
-        </w:numPr>
-        <w:spacing w:after="60" w:before="60"/>
-      </w:pPr>
-      <w:r>
-        <w:rPr>
-          <w:color w:val="213547"/>
-          <w:sz w:val="22"/>
-          <w:szCs w:val="22"/>
-        </w:rPr>
-        <w:t xml:space="preserve">Users can join an organisation from within their own account menu</w:t>
-      </w:r>
-    </w:p>
-    <w:p>
-      <w:pPr>
-        <w:pStyle w:val="ListParagraph"/>
-        <w:numPr>
-          <w:ilvl w:val="0"/>
-          <w:numId w:val="1"/>
-        </w:numPr>
-        <w:spacing w:after="60" w:before="60"/>
-      </w:pPr>
-      <w:r>
-        <w:rPr>
-          <w:color w:val="213547"/>
-          <w:sz w:val="22"/>
-          <w:szCs w:val="22"/>
-        </w:rPr>
-        <w:t xml:space="preserve">Admin dashboard showing aggregated, anonymised social value and hours across all members</w:t>
-      </w:r>
-    </w:p>
-    <w:p>
-      <w:pPr>
-        <w:pStyle w:val="ListParagraph"/>
-        <w:numPr>
-          <w:ilvl w:val="0"/>
-          <w:numId w:val="1"/>
-        </w:numPr>
-        <w:spacing w:after="60" w:before="60"/>
-      </w:pPr>
-      <w:r>
-        <w:rPr>
-          <w:color w:val="213547"/>
-          <w:sz w:val="22"/>
-          <w:szCs w:val="22"/>
-        </w:rPr>
-        <w:t xml:space="preserve">Organisation type switcher in the demo dashboard (charity, school, university, local authority)</w:t>
-      </w:r>
-    </w:p>
-    <w:p>
-      <w:pPr>
-        <w:pStyle w:val="ListParagraph"/>
-        <w:numPr>
-          <w:ilvl w:val="0"/>
-          <w:numId w:val="1"/>
-        </w:numPr>
-        <w:spacing w:after="60" w:before="60"/>
-      </w:pPr>
-      <w:r>
-        <w:rPr>
-          <w:color w:val="213547"/>
-          <w:sz w:val="22"/>
-          <w:szCs w:val="22"/>
-        </w:rPr>
-        <w:t xml:space="preserve">Period selector supporting both academic year and calendar year views</w:t>
-      </w:r>
-    </w:p>
-    <w:p>
-      <w:pPr>
-        <w:pStyle w:val="ListParagraph"/>
-        <w:numPr>
-          <w:ilvl w:val="0"/>
-          <w:numId w:val="1"/>
-        </w:numPr>
-        <w:spacing w:after="60" w:before="60"/>
-      </w:pPr>
-      <w:r>
-        <w:rPr>
-          <w:color w:val="213547"/>
-          <w:sz w:val="22"/>
-          <w:szCs w:val="22"/>
-        </w:rPr>
-        <w:t xml:space="preserve">Bulk member invite functionality</w:t>
-      </w:r>
-    </w:p>
-    <w:p>
-      <w:pPr>
-        <w:pStyle w:val="ListParagraph"/>
-        <w:numPr>
-          <w:ilvl w:val="0"/>
-          <w:numId w:val="1"/>
-        </w:numPr>
-        <w:spacing w:after="60" w:before="60"/>
-      </w:pPr>
-      <w:r>
-        <w:rPr>
-          <w:color w:val="213547"/>
-          <w:sz w:val="22"/>
-          <w:szCs w:val="22"/>
-        </w:rPr>
-        <w:t xml:space="preserve">PDF report export for the organisation's aggregated impact data</w:t>
-      </w:r>
-    </w:p>
-    <w:p>
-      <w:pPr>
-        <w:pStyle w:val="ListParagraph"/>
-        <w:numPr>
-          <w:ilvl w:val="0"/>
-          <w:numId w:val="1"/>
-        </w:numPr>
-        <w:spacing w:after="60" w:before="60"/>
-      </w:pPr>
-      <w:r>
-        <w:rPr>
-          <w:color w:val="213547"/>
-          <w:sz w:val="22"/>
-          <w:szCs w:val="22"/>
-        </w:rPr>
-        <w:t xml:space="preserve">Education-specific dashboard language and statistics</w:t>
-      </w:r>
-    </w:p>
-    <w:p>
-      <w:pPr>
-        <w:pStyle w:val="ListParagraph"/>
-        <w:numPr>
-          <w:ilvl w:val="0"/>
-          <w:numId w:val="1"/>
-        </w:numPr>
-        <w:spacing w:after="60" w:before="60"/>
-      </w:pPr>
-      <w:r>
-        <w:rPr>
-          <w:color w:val="213547"/>
-          <w:sz w:val="22"/>
-          <w:szCs w:val="22"/>
-        </w:rPr>
-        <w:t xml:space="preserve">Two seeded demo dashboards with realistic data, updating live as real member data comes in</w:t>
+        <w:t xml:space="preserve">AI Sidekick</w:t>
+      </w:r>
+    </w:p>
+    <w:p>
+      <w:pPr>
+        <w:pStyle w:val="ListParagraph"/>
+        <w:numPr>
+          <w:ilvl w:val="0"/>
+          <w:numId w:val="1"/>
+        </w:numPr>
+        <w:spacing w:after="60" w:before="60"/>
+      </w:pPr>
+      <w:r>
+        <w:rPr>
+          <w:color w:val="213547"/>
+          <w:sz w:val="22"/>
+          <w:szCs w:val="22"/>
+        </w:rPr>
+        <w:t xml:space="preserve">Embedded AI chat assistant powered by OpenAI, available on every page</w:t>
+      </w:r>
+    </w:p>
+    <w:p>
+      <w:pPr>
+        <w:pStyle w:val="ListParagraph"/>
+        <w:numPr>
+          <w:ilvl w:val="0"/>
+          <w:numId w:val="1"/>
+        </w:numPr>
+        <w:spacing w:after="60" w:before="60"/>
+      </w:pPr>
+      <w:r>
+        <w:rPr>
+          <w:color w:val="213547"/>
+          <w:sz w:val="22"/>
+          <w:szCs w:val="22"/>
+        </w:rPr>
+        <w:t xml:space="preserve">On desktop, the Sidekick panel pushes page content sideways rather than overlaying it, eliminating any overlap with navigation or content</w:t>
+      </w:r>
+    </w:p>
+    <w:p>
+      <w:pPr>
+        <w:pStyle w:val="ListParagraph"/>
+        <w:numPr>
+          <w:ilvl w:val="0"/>
+          <w:numId w:val="1"/>
+        </w:numPr>
+        <w:spacing w:after="60" w:before="60"/>
+      </w:pPr>
+      <w:r>
+        <w:rPr>
+          <w:color w:val="213547"/>
+          <w:sz w:val="22"/>
+          <w:szCs w:val="22"/>
+        </w:rPr>
+        <w:t xml:space="preserve">Capable of answering social value questions, helping draft CV bullet points, supporting UCAS personal statement writing, and writing apprenticeship supporting statements</w:t>
+      </w:r>
+    </w:p>
+    <w:p>
+      <w:pPr>
+        <w:pStyle w:val="ListParagraph"/>
+        <w:numPr>
+          <w:ilvl w:val="0"/>
+          <w:numId w:val="1"/>
+        </w:numPr>
+        <w:spacing w:after="60" w:before="60"/>
+      </w:pPr>
+      <w:r>
+        <w:rPr>
+          <w:color w:val="213547"/>
+          <w:sz w:val="22"/>
+          <w:szCs w:val="22"/>
+        </w:rPr>
+        <w:t xml:space="preserve">Responses use plain, accessible language rather than technical terminology</w:t>
+      </w:r>
+    </w:p>
+    <w:p>
+      <w:pPr>
+        <w:pStyle w:val="ListParagraph"/>
+        <w:numPr>
+          <w:ilvl w:val="0"/>
+          <w:numId w:val="1"/>
+        </w:numPr>
+        <w:spacing w:after="60" w:before="60"/>
+      </w:pPr>
+      <w:r>
+        <w:rPr>
+          <w:color w:val="213547"/>
+          <w:sz w:val="22"/>
+          <w:szCs w:val="22"/>
+        </w:rPr>
+        <w:t xml:space="preserve">Persona-specific depth for the following user journeys:</w:t>
+      </w:r>
+    </w:p>
+    <w:p>
+      <w:pPr>
+        <w:pStyle w:val="ListParagraph"/>
+        <w:numPr>
+          <w:ilvl w:val="0"/>
+          <w:numId w:val="1"/>
+        </w:numPr>
+        <w:spacing w:after="60" w:before="60"/>
+      </w:pPr>
+      <w:r>
+        <w:rPr>
+          <w:color w:val="213547"/>
+          <w:sz w:val="22"/>
+          <w:szCs w:val="22"/>
+        </w:rPr>
+        <w:t xml:space="preserve">  Returning to work: covers redundancy, mental health recovery, and caring responsibilities; leads with acknowledgement of self-doubt before practical help</w:t>
+      </w:r>
+    </w:p>
+    <w:p>
+      <w:pPr>
+        <w:pStyle w:val="ListParagraph"/>
+        <w:numPr>
+          <w:ilvl w:val="0"/>
+          <w:numId w:val="1"/>
+        </w:numPr>
+        <w:spacing w:after="60" w:before="60"/>
+      </w:pPr>
+      <w:r>
+        <w:rPr>
+          <w:color w:val="213547"/>
+          <w:sz w:val="22"/>
+          <w:szCs w:val="22"/>
+        </w:rPr>
+        <w:t xml:space="preserve">  Informal carer: confirms caring counts, avoids asking for exact hours, frames the employment gap honestly with named transferable skills</w:t>
+      </w:r>
+    </w:p>
+    <w:p>
+      <w:pPr>
+        <w:pStyle w:val="ListParagraph"/>
+        <w:numPr>
+          <w:ilvl w:val="0"/>
+          <w:numId w:val="1"/>
+        </w:numPr>
+        <w:spacing w:after="60" w:before="60"/>
+      </w:pPr>
+      <w:r>
+        <w:rPr>
+          <w:color w:val="213547"/>
+          <w:sz w:val="22"/>
+          <w:szCs w:val="22"/>
+        </w:rPr>
+        <w:t xml:space="preserve">  Scepticism handling: acknowledges frustration without hollow reassurance; explains what the platform concretely provides versus what it cannot guarantee</w:t>
+      </w:r>
+    </w:p>
+    <w:p>
+      <w:pPr>
+        <w:pStyle w:val="ListParagraph"/>
+        <w:numPr>
+          <w:ilvl w:val="0"/>
+          <w:numId w:val="1"/>
+        </w:numPr>
+        <w:spacing w:after="60" w:before="60"/>
+      </w:pPr>
+      <w:r>
+        <w:rPr>
+          <w:color w:val="213547"/>
+          <w:sz w:val="22"/>
+          <w:szCs w:val="22"/>
+        </w:rPr>
+        <w:t xml:space="preserve">  Charity manager / org admin: funder reporting guidance, volunteer onboarding support, and trustee scepticism framing</w:t>
+      </w:r>
+    </w:p>
+    <w:p>
+      <w:pPr>
+        <w:pStyle w:val="ListParagraph"/>
+        <w:numPr>
+          <w:ilvl w:val="0"/>
+          <w:numId w:val="1"/>
+        </w:numPr>
+        <w:spacing w:after="60" w:before="60"/>
+      </w:pPr>
+      <w:r>
+        <w:rPr>
+          <w:color w:val="213547"/>
+          <w:sz w:val="22"/>
+          <w:szCs w:val="22"/>
+        </w:rPr>
+        <w:t xml:space="preserve">  Apprenticeship: assessor evidence criteria, supporting statement structure with sample paragraph format</w:t>
+      </w:r>
+    </w:p>
+    <w:p>
+      <w:pPr>
+        <w:pStyle w:val="ListParagraph"/>
+        <w:numPr>
+          <w:ilvl w:val="0"/>
+          <w:numId w:val="1"/>
+        </w:numPr>
+        <w:spacing w:after="60" w:before="60"/>
+      </w:pPr>
+      <w:r>
+        <w:rPr>
+          <w:color w:val="213547"/>
+          <w:sz w:val="22"/>
+          <w:szCs w:val="22"/>
+        </w:rPr>
+        <w:t xml:space="preserve">  Armed forces / veteran: transition framing, civilian employer language, and export of quantified evidence</w:t>
+      </w:r>
+    </w:p>
+    <w:p>
+      <w:pPr>
+        <w:pStyle w:val="ListParagraph"/>
+        <w:numPr>
+          <w:ilvl w:val="0"/>
+          <w:numId w:val="1"/>
+        </w:numPr>
+        <w:spacing w:after="60" w:before="60"/>
+      </w:pPr>
+      <w:r>
+        <w:rPr>
+          <w:color w:val="213547"/>
+          <w:sz w:val="22"/>
+          <w:szCs w:val="22"/>
+        </w:rPr>
+        <w:t xml:space="preserve">Sidekick knows when it is talking to an organisation manager and adjusts its responses accordingly</w:t>
+      </w:r>
+    </w:p>
+    <w:p>
+      <w:pPr>
+        <w:pStyle w:val="ListParagraph"/>
+        <w:numPr>
+          <w:ilvl w:val="0"/>
+          <w:numId w:val="1"/>
+        </w:numPr>
+        <w:spacing w:after="60" w:before="60"/>
+      </w:pPr>
+      <w:r>
+        <w:rPr>
+          <w:color w:val="213547"/>
+          <w:sz w:val="22"/>
+          <w:szCs w:val="22"/>
+        </w:rPr>
+        <w:t xml:space="preserve">Honest answers about sharing options: distinguishes between impact statement copy, PDF download, and social media share; clarifies that no public profile URL exists</w:t>
+      </w:r>
+    </w:p>
+    <w:p>
+      <w:pPr>
+        <w:pStyle w:val="ListParagraph"/>
+        <w:numPr>
+          <w:ilvl w:val="0"/>
+          <w:numId w:val="1"/>
+        </w:numPr>
+        <w:spacing w:after="60" w:before="60"/>
+      </w:pPr>
+      <w:r>
+        <w:rPr>
+          <w:color w:val="213547"/>
+          <w:sz w:val="22"/>
+          <w:szCs w:val="22"/>
+        </w:rPr>
+        <w:t xml:space="preserve">Contextual quick-action prompts change per page to surface the most relevant questions</w:t>
+      </w:r>
+    </w:p>
+    <w:p>
+      <w:pPr>
+        <w:pStyle w:val="ListParagraph"/>
+        <w:numPr>
+          <w:ilvl w:val="0"/>
+          <w:numId w:val="1"/>
+        </w:numPr>
+        <w:spacing w:after="60" w:before="60"/>
+      </w:pPr>
+      <w:r>
+        <w:rPr>
+          <w:color w:val="213547"/>
+          <w:sz w:val="22"/>
+          <w:szCs w:val="22"/>
+        </w:rPr>
+        <w:t xml:space="preserve">Animated thinking indicator shown while a response is being generated</w:t>
       </w:r>
     </w:p>
     <w:p>
@@ -1290,97 +1380,79 @@
           <w:sz w:val="28"/>
           <w:szCs w:val="28"/>
         </w:rPr>
-        <w:t xml:space="preserve">Accessibility and Device Support</w:t>
-      </w:r>
-    </w:p>
-    <w:p>
-      <w:pPr>
-        <w:pStyle w:val="ListParagraph"/>
-        <w:numPr>
-          <w:ilvl w:val="0"/>
-          <w:numId w:val="1"/>
-        </w:numPr>
-        <w:spacing w:after="60" w:before="60"/>
-      </w:pPr>
-      <w:r>
-        <w:rPr>
-          <w:color w:val="213547"/>
-          <w:sz w:val="22"/>
-          <w:szCs w:val="22"/>
-        </w:rPr>
-        <w:t xml:space="preserve">High contrast mode available throughout the application</w:t>
-      </w:r>
-    </w:p>
-    <w:p>
-      <w:pPr>
-        <w:pStyle w:val="ListParagraph"/>
-        <w:numPr>
-          <w:ilvl w:val="0"/>
-          <w:numId w:val="1"/>
-        </w:numPr>
-        <w:spacing w:after="60" w:before="60"/>
-      </w:pPr>
-      <w:r>
-        <w:rPr>
-          <w:color w:val="213547"/>
-          <w:sz w:val="22"/>
-          <w:szCs w:val="22"/>
-        </w:rPr>
-        <w:t xml:space="preserve">Graphics and iconography reviewed for accessibility compliance</w:t>
-      </w:r>
-    </w:p>
-    <w:p>
-      <w:pPr>
-        <w:pStyle w:val="ListParagraph"/>
-        <w:numPr>
-          <w:ilvl w:val="0"/>
-          <w:numId w:val="1"/>
-        </w:numPr>
-        <w:spacing w:after="60" w:before="60"/>
-      </w:pPr>
-      <w:r>
-        <w:rPr>
-          <w:color w:val="213547"/>
-          <w:sz w:val="22"/>
-          <w:szCs w:val="22"/>
-        </w:rPr>
-        <w:t xml:space="preserve">Full mobile experience review and fix pass</w:t>
-      </w:r>
-    </w:p>
-    <w:p>
-      <w:pPr>
-        <w:pStyle w:val="ListParagraph"/>
-        <w:numPr>
-          <w:ilvl w:val="0"/>
-          <w:numId w:val="1"/>
-        </w:numPr>
-        <w:spacing w:after="60" w:before="60"/>
-      </w:pPr>
-      <w:r>
-        <w:rPr>
-          <w:color w:val="213547"/>
-          <w:sz w:val="22"/>
-          <w:szCs w:val="22"/>
-        </w:rPr>
-        <w:t xml:space="preserve">Step progress indicator label overlap resolved</w:t>
-      </w:r>
-    </w:p>
-    <w:p>
-      <w:pPr>
-        <w:pStyle w:val="ListParagraph"/>
-        <w:numPr>
-          <w:ilvl w:val="0"/>
-          <w:numId w:val="1"/>
-        </w:numPr>
-        <w:spacing w:after="60" w:before="60"/>
-      </w:pPr>
-      <w:r>
-        <w:rPr>
-          <w:color w:val="213547"/>
-          <w:sz w:val="22"/>
-          <w:szCs w:val="22"/>
-        </w:rPr>
-        <w:t xml:space="preserve">Application installable to a phone or tablet home screen as a native-style app (with custom icon)</w:t>
+        <w:t xml:space="preserve">Sharing and Export</w:t>
+      </w:r>
+    </w:p>
+    <w:p>
+      <w:pPr>
+        <w:pStyle w:val="ListParagraph"/>
+        <w:numPr>
+          <w:ilvl w:val="0"/>
+          <w:numId w:val="1"/>
+        </w:numPr>
+        <w:spacing w:after="60" w:before="60"/>
+      </w:pPr>
+      <w:r>
+        <w:rPr>
+          <w:color w:val="213547"/>
+          <w:sz w:val="22"/>
+          <w:szCs w:val="22"/>
+        </w:rPr>
+        <w:t xml:space="preserve">Impact statement: a ready-to-copy paragraph formatted for job applications, UCAS personal statements, and apprenticeship forms</w:t>
+      </w:r>
+    </w:p>
+    <w:p>
+      <w:pPr>
+        <w:pStyle w:val="ListParagraph"/>
+        <w:numPr>
+          <w:ilvl w:val="0"/>
+          <w:numId w:val="1"/>
+        </w:numPr>
+        <w:spacing w:after="60" w:before="60"/>
+      </w:pPr>
+      <w:r>
+        <w:rPr>
+          <w:color w:val="213547"/>
+          <w:sz w:val="22"/>
+          <w:szCs w:val="22"/>
+        </w:rPr>
+        <w:t xml:space="preserve">PDF impact report exported in a format suitable for attaching to applications or sending directly</w:t>
+      </w:r>
+    </w:p>
+    <w:p>
+      <w:pPr>
+        <w:pStyle w:val="ListParagraph"/>
+        <w:numPr>
+          <w:ilvl w:val="0"/>
+          <w:numId w:val="1"/>
+        </w:numPr>
+        <w:spacing w:after="60" w:before="60"/>
+      </w:pPr>
+      <w:r>
+        <w:rPr>
+          <w:color w:val="213547"/>
+          <w:sz w:val="22"/>
+          <w:szCs w:val="22"/>
+        </w:rPr>
+        <w:t xml:space="preserve">Shareable social media image (PNG) of impact statistics</w:t>
+      </w:r>
+    </w:p>
+    <w:p>
+      <w:pPr>
+        <w:pStyle w:val="ListParagraph"/>
+        <w:numPr>
+          <w:ilvl w:val="0"/>
+          <w:numId w:val="1"/>
+        </w:numPr>
+        <w:spacing w:after="60" w:before="60"/>
+      </w:pPr>
+      <w:r>
+        <w:rPr>
+          <w:color w:val="213547"/>
+          <w:sz w:val="22"/>
+          <w:szCs w:val="22"/>
+        </w:rPr>
+        <w:t xml:space="preserve">Milestone share cards with platform-specific formats (landscape / portrait) and one-click social sharing</w:t>
       </w:r>
     </w:p>
     <w:p>
@@ -1398,25 +1470,205 @@
           <w:sz w:val="28"/>
           <w:szCs w:val="28"/>
         </w:rPr>
-        <w:t xml:space="preserve">Admin and Analytics</w:t>
-      </w:r>
-    </w:p>
-    <w:p>
-      <w:pPr>
-        <w:pStyle w:val="ListParagraph"/>
-        <w:numPr>
-          <w:ilvl w:val="0"/>
-          <w:numId w:val="1"/>
-        </w:numPr>
-        <w:spacing w:after="60" w:before="60"/>
-      </w:pPr>
-      <w:r>
-        <w:rPr>
-          <w:color w:val="213547"/>
-          <w:sz w:val="22"/>
-          <w:szCs w:val="22"/>
-        </w:rPr>
-        <w:t xml:space="preserve">Admin panel with page view tracking across the platform</w:t>
+        <w:t xml:space="preserve">Organisation Portal</w:t>
+      </w:r>
+    </w:p>
+    <w:p>
+      <w:pPr>
+        <w:pStyle w:val="ListParagraph"/>
+        <w:numPr>
+          <w:ilvl w:val="0"/>
+          <w:numId w:val="1"/>
+        </w:numPr>
+        <w:spacing w:after="60" w:before="60"/>
+      </w:pPr>
+      <w:r>
+        <w:rPr>
+          <w:color w:val="213547"/>
+          <w:sz w:val="22"/>
+          <w:szCs w:val="22"/>
+        </w:rPr>
+        <w:t xml:space="preserve">Organisation registration flow for schools, charities, universities, and local authorities</w:t>
+      </w:r>
+    </w:p>
+    <w:p>
+      <w:pPr>
+        <w:pStyle w:val="ListParagraph"/>
+        <w:numPr>
+          <w:ilvl w:val="0"/>
+          <w:numId w:val="1"/>
+        </w:numPr>
+        <w:spacing w:after="60" w:before="60"/>
+      </w:pPr>
+      <w:r>
+        <w:rPr>
+          <w:color w:val="213547"/>
+          <w:sz w:val="22"/>
+          <w:szCs w:val="22"/>
+        </w:rPr>
+        <w:t xml:space="preserve">Confirmation email sent to the registering admin via Resend</w:t>
+      </w:r>
+    </w:p>
+    <w:p>
+      <w:pPr>
+        <w:pStyle w:val="ListParagraph"/>
+        <w:numPr>
+          <w:ilvl w:val="0"/>
+          <w:numId w:val="1"/>
+        </w:numPr>
+        <w:spacing w:after="60" w:before="60"/>
+      </w:pPr>
+      <w:r>
+        <w:rPr>
+          <w:color w:val="213547"/>
+          <w:sz w:val="22"/>
+          <w:szCs w:val="22"/>
+        </w:rPr>
+        <w:t xml:space="preserve">Unique invite code and shareable invite link generated per organisation</w:t>
+      </w:r>
+    </w:p>
+    <w:p>
+      <w:pPr>
+        <w:pStyle w:val="ListParagraph"/>
+        <w:numPr>
+          <w:ilvl w:val="0"/>
+          <w:numId w:val="1"/>
+        </w:numPr>
+        <w:spacing w:after="60" w:before="60"/>
+      </w:pPr>
+      <w:r>
+        <w:rPr>
+          <w:color w:val="213547"/>
+          <w:sz w:val="22"/>
+          <w:szCs w:val="22"/>
+        </w:rPr>
+        <w:t xml:space="preserve">Organisation-contextual login screen shown when users arrive via an invite link</w:t>
+      </w:r>
+    </w:p>
+    <w:p>
+      <w:pPr>
+        <w:pStyle w:val="ListParagraph"/>
+        <w:numPr>
+          <w:ilvl w:val="0"/>
+          <w:numId w:val="1"/>
+        </w:numPr>
+        <w:spacing w:after="60" w:before="60"/>
+      </w:pPr>
+      <w:r>
+        <w:rPr>
+          <w:color w:val="213547"/>
+          <w:sz w:val="22"/>
+          <w:szCs w:val="22"/>
+        </w:rPr>
+        <w:t xml:space="preserve">Users can join an organisation from within their own account</w:t>
+      </w:r>
+    </w:p>
+    <w:p>
+      <w:pPr>
+        <w:pStyle w:val="ListParagraph"/>
+        <w:numPr>
+          <w:ilvl w:val="0"/>
+          <w:numId w:val="1"/>
+        </w:numPr>
+        <w:spacing w:after="60" w:before="60"/>
+      </w:pPr>
+      <w:r>
+        <w:rPr>
+          <w:color w:val="213547"/>
+          <w:sz w:val="22"/>
+          <w:szCs w:val="22"/>
+        </w:rPr>
+        <w:t xml:space="preserve">Admin dashboard showing aggregated, anonymised social value and hours across all members</w:t>
+      </w:r>
+    </w:p>
+    <w:p>
+      <w:pPr>
+        <w:pStyle w:val="ListParagraph"/>
+        <w:numPr>
+          <w:ilvl w:val="0"/>
+          <w:numId w:val="1"/>
+        </w:numPr>
+        <w:spacing w:after="60" w:before="60"/>
+      </w:pPr>
+      <w:r>
+        <w:rPr>
+          <w:color w:val="213547"/>
+          <w:sz w:val="22"/>
+          <w:szCs w:val="22"/>
+        </w:rPr>
+        <w:t xml:space="preserve">Organisation type switcher in the demo dashboard (charity, school, university, local authority)</w:t>
+      </w:r>
+    </w:p>
+    <w:p>
+      <w:pPr>
+        <w:pStyle w:val="ListParagraph"/>
+        <w:numPr>
+          <w:ilvl w:val="0"/>
+          <w:numId w:val="1"/>
+        </w:numPr>
+        <w:spacing w:after="60" w:before="60"/>
+      </w:pPr>
+      <w:r>
+        <w:rPr>
+          <w:color w:val="213547"/>
+          <w:sz w:val="22"/>
+          <w:szCs w:val="22"/>
+        </w:rPr>
+        <w:t xml:space="preserve">Period selector supporting both academic year and calendar year views</w:t>
+      </w:r>
+    </w:p>
+    <w:p>
+      <w:pPr>
+        <w:pStyle w:val="ListParagraph"/>
+        <w:numPr>
+          <w:ilvl w:val="0"/>
+          <w:numId w:val="1"/>
+        </w:numPr>
+        <w:spacing w:after="60" w:before="60"/>
+      </w:pPr>
+      <w:r>
+        <w:rPr>
+          <w:color w:val="213547"/>
+          <w:sz w:val="22"/>
+          <w:szCs w:val="22"/>
+        </w:rPr>
+        <w:t xml:space="preserve">Bulk member invite functionality</w:t>
+      </w:r>
+    </w:p>
+    <w:p>
+      <w:pPr>
+        <w:pStyle w:val="ListParagraph"/>
+        <w:numPr>
+          <w:ilvl w:val="0"/>
+          <w:numId w:val="1"/>
+        </w:numPr>
+        <w:spacing w:after="60" w:before="60"/>
+      </w:pPr>
+      <w:r>
+        <w:rPr>
+          <w:color w:val="213547"/>
+          <w:sz w:val="22"/>
+          <w:szCs w:val="22"/>
+        </w:rPr>
+        <w:t xml:space="preserve">PDF report export for the organisation's aggregated impact data</w:t>
+      </w:r>
+    </w:p>
+    <w:p>
+      <w:pPr>
+        <w:pStyle w:val="ListParagraph"/>
+        <w:numPr>
+          <w:ilvl w:val="0"/>
+          <w:numId w:val="1"/>
+        </w:numPr>
+        <w:spacing w:after="60" w:before="60"/>
+      </w:pPr>
+      <w:r>
+        <w:rPr>
+          <w:color w:val="213547"/>
+          <w:sz w:val="22"/>
+          <w:szCs w:val="22"/>
+        </w:rPr>
+        <w:t xml:space="preserve">Education-specific dashboard language and statistics</w:t>
       </w:r>
     </w:p>
     <w:p>
@@ -1434,6 +1686,420 @@
           <w:sz w:val="28"/>
           <w:szCs w:val="28"/>
         </w:rPr>
+        <w:t xml:space="preserve">Contact and Feedback</w:t>
+      </w:r>
+    </w:p>
+    <w:p>
+      <w:pPr>
+        <w:pStyle w:val="ListParagraph"/>
+        <w:numPr>
+          <w:ilvl w:val="0"/>
+          <w:numId w:val="1"/>
+        </w:numPr>
+        <w:spacing w:after="60" w:before="60"/>
+      </w:pPr>
+      <w:r>
+        <w:rPr>
+          <w:color w:val="213547"/>
+          <w:sz w:val="22"/>
+          <w:szCs w:val="22"/>
+        </w:rPr>
+        <w:t xml:space="preserve">Contact form at /contact with name, email, and message fields</w:t>
+      </w:r>
+    </w:p>
+    <w:p>
+      <w:pPr>
+        <w:pStyle w:val="ListParagraph"/>
+        <w:numPr>
+          <w:ilvl w:val="0"/>
+          <w:numId w:val="1"/>
+        </w:numPr>
+        <w:spacing w:after="60" w:before="60"/>
+      </w:pPr>
+      <w:r>
+        <w:rPr>
+          <w:color w:val="213547"/>
+          <w:sz w:val="22"/>
+          <w:szCs w:val="22"/>
+        </w:rPr>
+        <w:t xml:space="preserve">Contact submissions trigger a notification email to the team and a confirmation email to the sender</w:t>
+      </w:r>
+    </w:p>
+    <w:p>
+      <w:pPr>
+        <w:pStyle w:val="ListParagraph"/>
+        <w:numPr>
+          <w:ilvl w:val="0"/>
+          <w:numId w:val="1"/>
+        </w:numPr>
+        <w:spacing w:after="60" w:before="60"/>
+      </w:pPr>
+      <w:r>
+        <w:rPr>
+          <w:color w:val="213547"/>
+          <w:sz w:val="22"/>
+          <w:szCs w:val="22"/>
+        </w:rPr>
+        <w:t xml:space="preserve">Toggleable feedback mode available from the account menu: clicking any element on screen opens a contextual feedback form</w:t>
+      </w:r>
+    </w:p>
+    <w:p>
+      <w:pPr>
+        <w:pStyle w:val="ListParagraph"/>
+        <w:numPr>
+          <w:ilvl w:val="0"/>
+          <w:numId w:val="1"/>
+        </w:numPr>
+        <w:spacing w:after="60" w:before="60"/>
+      </w:pPr>
+      <w:r>
+        <w:rPr>
+          <w:color w:val="213547"/>
+          <w:sz w:val="22"/>
+          <w:szCs w:val="22"/>
+        </w:rPr>
+        <w:t xml:space="preserve">Standalone feedback page at /feedback for general comments and suggestions</w:t>
+      </w:r>
+    </w:p>
+    <w:p>
+      <w:pPr>
+        <w:pStyle w:val="ListParagraph"/>
+        <w:numPr>
+          <w:ilvl w:val="0"/>
+          <w:numId w:val="1"/>
+        </w:numPr>
+        <w:spacing w:after="60" w:before="60"/>
+      </w:pPr>
+      <w:r>
+        <w:rPr>
+          <w:color w:val="213547"/>
+          <w:sz w:val="22"/>
+          <w:szCs w:val="22"/>
+        </w:rPr>
+        <w:t xml:space="preserve">Feedback is stored in the database alongside any associated user account and page URL</w:t>
+      </w:r>
+    </w:p>
+    <w:p>
+      <w:pPr>
+        <w:pBdr>
+          <w:bottom w:val="single" w:color="E8633A" w:sz="6" w:space="4"/>
+        </w:pBdr>
+        <w:spacing w:after="120" w:before="360"/>
+      </w:pPr>
+      <w:r>
+        <w:rPr>
+          <w:b/>
+          <w:bCs/>
+          <w:color w:val="E8633A"/>
+          <w:sz w:val="28"/>
+          <w:szCs w:val="28"/>
+        </w:rPr>
+        <w:t xml:space="preserve">Public Pages</w:t>
+      </w:r>
+    </w:p>
+    <w:p>
+      <w:pPr>
+        <w:pStyle w:val="ListParagraph"/>
+        <w:numPr>
+          <w:ilvl w:val="0"/>
+          <w:numId w:val="1"/>
+        </w:numPr>
+        <w:spacing w:after="60" w:before="60"/>
+      </w:pPr>
+      <w:r>
+        <w:rPr>
+          <w:color w:val="213547"/>
+          <w:sz w:val="22"/>
+          <w:szCs w:val="22"/>
+        </w:rPr>
+        <w:t xml:space="preserve">What's New page at /whats-new summarising recent platform improvements in plain language, grouped by theme</w:t>
+      </w:r>
+    </w:p>
+    <w:p>
+      <w:pPr>
+        <w:pStyle w:val="ListParagraph"/>
+        <w:numPr>
+          <w:ilvl w:val="0"/>
+          <w:numId w:val="1"/>
+        </w:numPr>
+        <w:spacing w:after="60" w:before="60"/>
+      </w:pPr>
+      <w:r>
+        <w:rPr>
+          <w:color w:val="213547"/>
+          <w:sz w:val="22"/>
+          <w:szCs w:val="22"/>
+        </w:rPr>
+        <w:t xml:space="preserve">Privacy policy page at /privacy covering data collection, legal basis, cookies, third-party services, and user rights under UK GDPR</w:t>
+      </w:r>
+    </w:p>
+    <w:p>
+      <w:pPr>
+        <w:pStyle w:val="ListParagraph"/>
+        <w:numPr>
+          <w:ilvl w:val="0"/>
+          <w:numId w:val="1"/>
+        </w:numPr>
+        <w:spacing w:after="60" w:before="60"/>
+      </w:pPr>
+      <w:r>
+        <w:rPr>
+          <w:color w:val="213547"/>
+          <w:sz w:val="22"/>
+          <w:szCs w:val="22"/>
+        </w:rPr>
+        <w:t xml:space="preserve">About page describing the platform's purpose and social value methodology</w:t>
+      </w:r>
+    </w:p>
+    <w:p>
+      <w:pPr>
+        <w:pStyle w:val="ListParagraph"/>
+        <w:numPr>
+          <w:ilvl w:val="0"/>
+          <w:numId w:val="1"/>
+        </w:numPr>
+        <w:spacing w:after="60" w:before="60"/>
+      </w:pPr>
+      <w:r>
+        <w:rPr>
+          <w:color w:val="213547"/>
+          <w:sz w:val="22"/>
+          <w:szCs w:val="22"/>
+        </w:rPr>
+        <w:t xml:space="preserve">Contact page accessible without login</w:t>
+      </w:r>
+    </w:p>
+    <w:p>
+      <w:pPr>
+        <w:pStyle w:val="ListParagraph"/>
+        <w:numPr>
+          <w:ilvl w:val="0"/>
+          <w:numId w:val="1"/>
+        </w:numPr>
+        <w:spacing w:after="60" w:before="60"/>
+      </w:pPr>
+      <w:r>
+        <w:rPr>
+          <w:color w:val="213547"/>
+          <w:sz w:val="22"/>
+          <w:szCs w:val="22"/>
+        </w:rPr>
+        <w:t xml:space="preserve">All public pages linked from site footers</w:t>
+      </w:r>
+    </w:p>
+    <w:p>
+      <w:pPr>
+        <w:pBdr>
+          <w:bottom w:val="single" w:color="E8633A" w:sz="6" w:space="4"/>
+        </w:pBdr>
+        <w:spacing w:after="120" w:before="360"/>
+      </w:pPr>
+      <w:r>
+        <w:rPr>
+          <w:b/>
+          <w:bCs/>
+          <w:color w:val="E8633A"/>
+          <w:sz w:val="28"/>
+          <w:szCs w:val="28"/>
+        </w:rPr>
+        <w:t xml:space="preserve">Accessibility and Device Support</w:t>
+      </w:r>
+    </w:p>
+    <w:p>
+      <w:pPr>
+        <w:pStyle w:val="ListParagraph"/>
+        <w:numPr>
+          <w:ilvl w:val="0"/>
+          <w:numId w:val="1"/>
+        </w:numPr>
+        <w:spacing w:after="60" w:before="60"/>
+      </w:pPr>
+      <w:r>
+        <w:rPr>
+          <w:color w:val="213547"/>
+          <w:sz w:val="22"/>
+          <w:szCs w:val="22"/>
+        </w:rPr>
+        <w:t xml:space="preserve">High contrast mode available throughout the application</w:t>
+      </w:r>
+    </w:p>
+    <w:p>
+      <w:pPr>
+        <w:pStyle w:val="ListParagraph"/>
+        <w:numPr>
+          <w:ilvl w:val="0"/>
+          <w:numId w:val="1"/>
+        </w:numPr>
+        <w:spacing w:after="60" w:before="60"/>
+      </w:pPr>
+      <w:r>
+        <w:rPr>
+          <w:color w:val="213547"/>
+          <w:sz w:val="22"/>
+          <w:szCs w:val="22"/>
+        </w:rPr>
+        <w:t xml:space="preserve">Full mobile experience reviewed and tested</w:t>
+      </w:r>
+    </w:p>
+    <w:p>
+      <w:pPr>
+        <w:pStyle w:val="ListParagraph"/>
+        <w:numPr>
+          <w:ilvl w:val="0"/>
+          <w:numId w:val="1"/>
+        </w:numPr>
+        <w:spacing w:after="60" w:before="60"/>
+      </w:pPr>
+      <w:r>
+        <w:rPr>
+          <w:color w:val="213547"/>
+          <w:sz w:val="22"/>
+          <w:szCs w:val="22"/>
+        </w:rPr>
+        <w:t xml:space="preserve">Step progress indicator with clear labels at each stage</w:t>
+      </w:r>
+    </w:p>
+    <w:p>
+      <w:pPr>
+        <w:pStyle w:val="ListParagraph"/>
+        <w:numPr>
+          <w:ilvl w:val="0"/>
+          <w:numId w:val="1"/>
+        </w:numPr>
+        <w:spacing w:after="60" w:before="60"/>
+      </w:pPr>
+      <w:r>
+        <w:rPr>
+          <w:color w:val="213547"/>
+          <w:sz w:val="22"/>
+          <w:szCs w:val="22"/>
+        </w:rPr>
+        <w:t xml:space="preserve">Application installable to a phone or tablet home screen as a native-style app (PWA) with a custom branded icon</w:t>
+      </w:r>
+    </w:p>
+    <w:p>
+      <w:pPr>
+        <w:pStyle w:val="ListParagraph"/>
+        <w:numPr>
+          <w:ilvl w:val="0"/>
+          <w:numId w:val="1"/>
+        </w:numPr>
+        <w:spacing w:after="60" w:before="60"/>
+      </w:pPr>
+      <w:r>
+        <w:rPr>
+          <w:color w:val="213547"/>
+          <w:sz w:val="22"/>
+          <w:szCs w:val="22"/>
+        </w:rPr>
+        <w:t xml:space="preserve">Aria attributes on interactive elements including situation pills and interest toggles</w:t>
+      </w:r>
+    </w:p>
+    <w:p>
+      <w:pPr>
+        <w:pBdr>
+          <w:bottom w:val="single" w:color="E8633A" w:sz="6" w:space="4"/>
+        </w:pBdr>
+        <w:spacing w:after="120" w:before="360"/>
+      </w:pPr>
+      <w:r>
+        <w:rPr>
+          <w:b/>
+          <w:bCs/>
+          <w:color w:val="E8633A"/>
+          <w:sz w:val="28"/>
+          <w:szCs w:val="28"/>
+        </w:rPr>
+        <w:t xml:space="preserve">Admin and Analytics</w:t>
+      </w:r>
+    </w:p>
+    <w:p>
+      <w:pPr>
+        <w:pStyle w:val="ListParagraph"/>
+        <w:numPr>
+          <w:ilvl w:val="0"/>
+          <w:numId w:val="1"/>
+        </w:numPr>
+        <w:spacing w:after="60" w:before="60"/>
+      </w:pPr>
+      <w:r>
+        <w:rPr>
+          <w:color w:val="213547"/>
+          <w:sz w:val="22"/>
+          <w:szCs w:val="22"/>
+        </w:rPr>
+        <w:t xml:space="preserve">Admin panel at /admin showing all registered users with joined date and pages visited</w:t>
+      </w:r>
+    </w:p>
+    <w:p>
+      <w:pPr>
+        <w:pStyle w:val="ListParagraph"/>
+        <w:numPr>
+          <w:ilvl w:val="0"/>
+          <w:numId w:val="1"/>
+        </w:numPr>
+        <w:spacing w:after="60" w:before="60"/>
+      </w:pPr>
+      <w:r>
+        <w:rPr>
+          <w:color w:val="213547"/>
+          <w:sz w:val="22"/>
+          <w:szCs w:val="22"/>
+        </w:rPr>
+        <w:t xml:space="preserve">Page view tracking records each user's navigation across the platform</w:t>
+      </w:r>
+    </w:p>
+    <w:p>
+      <w:pPr>
+        <w:pStyle w:val="ListParagraph"/>
+        <w:numPr>
+          <w:ilvl w:val="0"/>
+          <w:numId w:val="1"/>
+        </w:numPr>
+        <w:spacing w:after="60" w:before="60"/>
+      </w:pPr>
+      <w:r>
+        <w:rPr>
+          <w:color w:val="213547"/>
+          <w:sz w:val="22"/>
+          <w:szCs w:val="22"/>
+        </w:rPr>
+        <w:t xml:space="preserve">Admin panel link visible only to authorised email addresses in the account menu</w:t>
+      </w:r>
+    </w:p>
+    <w:p>
+      <w:pPr>
+        <w:pStyle w:val="ListParagraph"/>
+        <w:numPr>
+          <w:ilvl w:val="0"/>
+          <w:numId w:val="1"/>
+        </w:numPr>
+        <w:spacing w:after="60" w:before="60"/>
+      </w:pPr>
+      <w:r>
+        <w:rPr>
+          <w:color w:val="213547"/>
+          <w:sz w:val="22"/>
+          <w:szCs w:val="22"/>
+        </w:rPr>
+        <w:t xml:space="preserve">Migration runner applies database schema changes in order, with idempotent SQL files</w:t>
+      </w:r>
+    </w:p>
+    <w:p>
+      <w:pPr>
+        <w:pBdr>
+          <w:bottom w:val="single" w:color="E8633A" w:sz="6" w:space="4"/>
+        </w:pBdr>
+        <w:spacing w:after="120" w:before="360"/>
+      </w:pPr>
+      <w:r>
+        <w:rPr>
+          <w:b/>
+          <w:bCs/>
+          <w:color w:val="E8633A"/>
+          <w:sz w:val="28"/>
+          <w:szCs w:val="28"/>
+        </w:rPr>
         <w:t xml:space="preserve">Personas Tested</w:t>
       </w:r>
     </w:p>
@@ -1501,7 +2167,61 @@
           <w:sz w:val="22"/>
           <w:szCs w:val="22"/>
         </w:rPr>
-        <w:t xml:space="preserve">Carer</w:t>
+        <w:t xml:space="preserve">Apprenticeship applicant</w:t>
+      </w:r>
+    </w:p>
+    <w:p>
+      <w:pPr>
+        <w:pStyle w:val="ListParagraph"/>
+        <w:numPr>
+          <w:ilvl w:val="0"/>
+          <w:numId w:val="1"/>
+        </w:numPr>
+        <w:spacing w:after="60" w:before="60"/>
+      </w:pPr>
+      <w:r>
+        <w:rPr>
+          <w:color w:val="213547"/>
+          <w:sz w:val="22"/>
+          <w:szCs w:val="22"/>
+        </w:rPr>
+        <w:t xml:space="preserve">Job seeker / NEET</w:t>
+      </w:r>
+    </w:p>
+    <w:p>
+      <w:pPr>
+        <w:pStyle w:val="ListParagraph"/>
+        <w:numPr>
+          <w:ilvl w:val="0"/>
+          <w:numId w:val="1"/>
+        </w:numPr>
+        <w:spacing w:after="60" w:before="60"/>
+      </w:pPr>
+      <w:r>
+        <w:rPr>
+          <w:color w:val="213547"/>
+          <w:sz w:val="22"/>
+          <w:szCs w:val="22"/>
+        </w:rPr>
+        <w:t xml:space="preserve">Person on a career break (including redundancy and mental health recovery)</w:t>
+      </w:r>
+    </w:p>
+    <w:p>
+      <w:pPr>
+        <w:pStyle w:val="ListParagraph"/>
+        <w:numPr>
+          <w:ilvl w:val="0"/>
+          <w:numId w:val="1"/>
+        </w:numPr>
+        <w:spacing w:after="60" w:before="60"/>
+      </w:pPr>
+      <w:r>
+        <w:rPr>
+          <w:color w:val="213547"/>
+          <w:sz w:val="22"/>
+          <w:szCs w:val="22"/>
+        </w:rPr>
+        <w:t xml:space="preserve">Informal carer</w:t>
       </w:r>
     </w:p>
     <w:p>
@@ -1537,43 +2257,25 @@
           <w:sz w:val="22"/>
           <w:szCs w:val="22"/>
         </w:rPr>
-        <w:t xml:space="preserve">Apprentice</w:t>
-      </w:r>
-    </w:p>
-    <w:p>
-      <w:pPr>
-        <w:pStyle w:val="ListParagraph"/>
-        <w:numPr>
-          <w:ilvl w:val="0"/>
-          <w:numId w:val="1"/>
-        </w:numPr>
-        <w:spacing w:after="60" w:before="60"/>
-      </w:pPr>
-      <w:r>
-        <w:rPr>
-          <w:color w:val="213547"/>
-          <w:sz w:val="22"/>
-          <w:szCs w:val="22"/>
-        </w:rPr>
-        <w:t xml:space="preserve">Job seeker / NEET</w:t>
-      </w:r>
-    </w:p>
-    <w:p>
-      <w:pPr>
-        <w:pStyle w:val="ListParagraph"/>
-        <w:numPr>
-          <w:ilvl w:val="0"/>
-          <w:numId w:val="1"/>
-        </w:numPr>
-        <w:spacing w:after="60" w:before="60"/>
-      </w:pPr>
-      <w:r>
-        <w:rPr>
-          <w:color w:val="213547"/>
-          <w:sz w:val="22"/>
-          <w:szCs w:val="22"/>
-        </w:rPr>
-        <w:t xml:space="preserve">Person on a career break</w:t>
+        <w:t xml:space="preserve">Charity manager / organisation administrator</w:t>
+      </w:r>
+    </w:p>
+    <w:p>
+      <w:pPr>
+        <w:pStyle w:val="ListParagraph"/>
+        <w:numPr>
+          <w:ilvl w:val="0"/>
+          <w:numId w:val="1"/>
+        </w:numPr>
+        <w:spacing w:after="60" w:before="60"/>
+      </w:pPr>
+      <w:r>
+        <w:rPr>
+          <w:color w:val="213547"/>
+          <w:sz w:val="22"/>
+          <w:szCs w:val="22"/>
+        </w:rPr>
+        <w:t xml:space="preserve">Trustee or governance lead (scepticism of data)</w:t>
       </w:r>
     </w:p>
     <w:p>

</xml_diff>

<commit_message>
Improve document formatting by using proper sub-bullet styles
Refactor scripts/generate-feature-list.mjs to introduce a `subbullet` function and replace space-indented bullets with proper nested bullets for the "AI Sidekick" section in the generated "My Impact - Full Feature List.docx" document.

Replit-Commit-Author: Agent
Replit-Commit-Session-Id: fc01c8a3-9924-4bf2-be2f-b9e30910e329
Replit-Commit-Checkpoint-Type: full_checkpoint
Replit-Commit-Event-Id: 97357eba-17ec-4f98-8e0d-6a4c24e08a48
Replit-Commit-Screenshot-Url: https://storage.googleapis.com/screenshot-production-us-central1/3c5ae835-1dbb-4841-9597-2070b721a8fa/fc01c8a3-9924-4bf2-be2f-b9e30910e329/TPGs429
Replit-Helium-Checkpoint-Created: true
</commit_message>
<xml_diff>
--- a/My Impact - Full Feature List.docx
+++ b/My Impact - Full Feature List.docx
@@ -1189,108 +1189,108 @@
       <w:pPr>
         <w:pStyle w:val="ListParagraph"/>
         <w:numPr>
-          <w:ilvl w:val="0"/>
-          <w:numId w:val="1"/>
-        </w:numPr>
-        <w:spacing w:after="60" w:before="60"/>
-      </w:pPr>
-      <w:r>
-        <w:rPr>
-          <w:color w:val="213547"/>
-          <w:sz w:val="22"/>
-          <w:szCs w:val="22"/>
-        </w:rPr>
-        <w:t xml:space="preserve">  Returning to work: covers redundancy, mental health recovery, and caring responsibilities; leads with acknowledgement of self-doubt before practical help</w:t>
-      </w:r>
-    </w:p>
-    <w:p>
-      <w:pPr>
-        <w:pStyle w:val="ListParagraph"/>
-        <w:numPr>
-          <w:ilvl w:val="0"/>
-          <w:numId w:val="1"/>
-        </w:numPr>
-        <w:spacing w:after="60" w:before="60"/>
-      </w:pPr>
-      <w:r>
-        <w:rPr>
-          <w:color w:val="213547"/>
-          <w:sz w:val="22"/>
-          <w:szCs w:val="22"/>
-        </w:rPr>
-        <w:t xml:space="preserve">  Informal carer: confirms caring counts, avoids asking for exact hours, frames the employment gap honestly with named transferable skills</w:t>
-      </w:r>
-    </w:p>
-    <w:p>
-      <w:pPr>
-        <w:pStyle w:val="ListParagraph"/>
-        <w:numPr>
-          <w:ilvl w:val="0"/>
-          <w:numId w:val="1"/>
-        </w:numPr>
-        <w:spacing w:after="60" w:before="60"/>
-      </w:pPr>
-      <w:r>
-        <w:rPr>
-          <w:color w:val="213547"/>
-          <w:sz w:val="22"/>
-          <w:szCs w:val="22"/>
-        </w:rPr>
-        <w:t xml:space="preserve">  Scepticism handling: acknowledges frustration without hollow reassurance; explains what the platform concretely provides versus what it cannot guarantee</w:t>
-      </w:r>
-    </w:p>
-    <w:p>
-      <w:pPr>
-        <w:pStyle w:val="ListParagraph"/>
-        <w:numPr>
-          <w:ilvl w:val="0"/>
-          <w:numId w:val="1"/>
-        </w:numPr>
-        <w:spacing w:after="60" w:before="60"/>
-      </w:pPr>
-      <w:r>
-        <w:rPr>
-          <w:color w:val="213547"/>
-          <w:sz w:val="22"/>
-          <w:szCs w:val="22"/>
-        </w:rPr>
-        <w:t xml:space="preserve">  Charity manager / org admin: funder reporting guidance, volunteer onboarding support, and trustee scepticism framing</w:t>
-      </w:r>
-    </w:p>
-    <w:p>
-      <w:pPr>
-        <w:pStyle w:val="ListParagraph"/>
-        <w:numPr>
-          <w:ilvl w:val="0"/>
-          <w:numId w:val="1"/>
-        </w:numPr>
-        <w:spacing w:after="60" w:before="60"/>
-      </w:pPr>
-      <w:r>
-        <w:rPr>
-          <w:color w:val="213547"/>
-          <w:sz w:val="22"/>
-          <w:szCs w:val="22"/>
-        </w:rPr>
-        <w:t xml:space="preserve">  Apprenticeship: assessor evidence criteria, supporting statement structure with sample paragraph format</w:t>
-      </w:r>
-    </w:p>
-    <w:p>
-      <w:pPr>
-        <w:pStyle w:val="ListParagraph"/>
-        <w:numPr>
-          <w:ilvl w:val="0"/>
-          <w:numId w:val="1"/>
-        </w:numPr>
-        <w:spacing w:after="60" w:before="60"/>
-      </w:pPr>
-      <w:r>
-        <w:rPr>
-          <w:color w:val="213547"/>
-          <w:sz w:val="22"/>
-          <w:szCs w:val="22"/>
-        </w:rPr>
-        <w:t xml:space="preserve">  Armed forces / veteran: transition framing, civilian employer language, and export of quantified evidence</w:t>
+          <w:ilvl w:val="1"/>
+          <w:numId w:val="1"/>
+        </w:numPr>
+        <w:spacing w:after="40" w:before="40"/>
+      </w:pPr>
+      <w:r>
+        <w:rPr>
+          <w:color w:val="213547"/>
+          <w:sz w:val="22"/>
+          <w:szCs w:val="22"/>
+        </w:rPr>
+        <w:t xml:space="preserve">Returning to work: covers redundancy, mental health recovery, and caring responsibilities; leads with acknowledgement of self-doubt before practical help</w:t>
+      </w:r>
+    </w:p>
+    <w:p>
+      <w:pPr>
+        <w:pStyle w:val="ListParagraph"/>
+        <w:numPr>
+          <w:ilvl w:val="1"/>
+          <w:numId w:val="1"/>
+        </w:numPr>
+        <w:spacing w:after="40" w:before="40"/>
+      </w:pPr>
+      <w:r>
+        <w:rPr>
+          <w:color w:val="213547"/>
+          <w:sz w:val="22"/>
+          <w:szCs w:val="22"/>
+        </w:rPr>
+        <w:t xml:space="preserve">Informal carer: confirms caring counts, avoids asking for exact hours, frames the employment gap honestly with named transferable skills</w:t>
+      </w:r>
+    </w:p>
+    <w:p>
+      <w:pPr>
+        <w:pStyle w:val="ListParagraph"/>
+        <w:numPr>
+          <w:ilvl w:val="1"/>
+          <w:numId w:val="1"/>
+        </w:numPr>
+        <w:spacing w:after="40" w:before="40"/>
+      </w:pPr>
+      <w:r>
+        <w:rPr>
+          <w:color w:val="213547"/>
+          <w:sz w:val="22"/>
+          <w:szCs w:val="22"/>
+        </w:rPr>
+        <w:t xml:space="preserve">Scepticism handling: acknowledges frustration without hollow reassurance; explains what the platform concretely provides versus what it cannot guarantee</w:t>
+      </w:r>
+    </w:p>
+    <w:p>
+      <w:pPr>
+        <w:pStyle w:val="ListParagraph"/>
+        <w:numPr>
+          <w:ilvl w:val="1"/>
+          <w:numId w:val="1"/>
+        </w:numPr>
+        <w:spacing w:after="40" w:before="40"/>
+      </w:pPr>
+      <w:r>
+        <w:rPr>
+          <w:color w:val="213547"/>
+          <w:sz w:val="22"/>
+          <w:szCs w:val="22"/>
+        </w:rPr>
+        <w:t xml:space="preserve">Charity manager / org admin: funder reporting guidance, volunteer onboarding support, and trustee scepticism framing</w:t>
+      </w:r>
+    </w:p>
+    <w:p>
+      <w:pPr>
+        <w:pStyle w:val="ListParagraph"/>
+        <w:numPr>
+          <w:ilvl w:val="1"/>
+          <w:numId w:val="1"/>
+        </w:numPr>
+        <w:spacing w:after="40" w:before="40"/>
+      </w:pPr>
+      <w:r>
+        <w:rPr>
+          <w:color w:val="213547"/>
+          <w:sz w:val="22"/>
+          <w:szCs w:val="22"/>
+        </w:rPr>
+        <w:t xml:space="preserve">Apprenticeship: assessor evidence criteria, supporting statement structure with sample paragraph format</w:t>
+      </w:r>
+    </w:p>
+    <w:p>
+      <w:pPr>
+        <w:pStyle w:val="ListParagraph"/>
+        <w:numPr>
+          <w:ilvl w:val="1"/>
+          <w:numId w:val="1"/>
+        </w:numPr>
+        <w:spacing w:after="40" w:before="40"/>
+      </w:pPr>
+      <w:r>
+        <w:rPr>
+          <w:color w:val="213547"/>
+          <w:sz w:val="22"/>
+          <w:szCs w:val="22"/>
+        </w:rPr>
+        <w:t xml:space="preserve">Armed forces / veteran: transition framing, civilian employer language, and export of quantified evidence</w:t>
       </w:r>
     </w:p>
     <w:p>

</xml_diff>